<commit_message>
Add invoice service, controller, models and types. Exceptions handling uncertain
</commit_message>
<xml_diff>
--- a/src/model/templates/INVOICE/invoice_template.docx
+++ b/src/model/templates/INVOICE/invoice_template.docx
@@ -281,9 +281,9 @@
       <w:tblGrid>
         <w:gridCol w:w="1004"/>
         <w:gridCol w:w="4834"/>
-        <w:gridCol w:w="1412"/>
+        <w:gridCol w:w="1411"/>
         <w:gridCol w:w="1561"/>
-        <w:gridCol w:w="1264"/>
+        <w:gridCol w:w="1265"/>
       </w:tblGrid>
       <w:tr>
         <w:trPr>
@@ -294,6 +294,8 @@
           <w:tcPr>
             <w:tcW w:w="1004" w:type="dxa"/>
             <w:tcBorders>
+              <w:top w:val="nil"/>
+              <w:left w:val="nil"/>
               <w:bottom w:val="single" w:sz="4" w:space="0" w:color="A6A6A6"/>
               <w:right w:val="nil"/>
             </w:tcBorders>
@@ -351,6 +353,7 @@
           <w:tcPr>
             <w:tcW w:w="4834" w:type="dxa"/>
             <w:tcBorders>
+              <w:top w:val="nil"/>
               <w:left w:val="nil"/>
               <w:bottom w:val="single" w:sz="4" w:space="0" w:color="A6A6A6"/>
               <w:right w:val="nil"/>
@@ -399,8 +402,9 @@
         </w:tc>
         <w:tc>
           <w:tcPr>
-            <w:tcW w:w="1412" w:type="dxa"/>
+            <w:tcW w:w="1411" w:type="dxa"/>
             <w:tcBorders>
+              <w:top w:val="nil"/>
               <w:left w:val="nil"/>
               <w:bottom w:val="single" w:sz="4" w:space="0" w:color="A6A6A6"/>
               <w:right w:val="nil"/>
@@ -421,7 +425,13 @@
               <w:rPr>
                 <w:rFonts w:eastAsia="Adobe Gothic Std B" w:ascii="Adobe Gothic Std B" w:hAnsi="Adobe Gothic Std B"/>
               </w:rPr>
-              <w:t>Days</w:t>
+              <w:t>Days/</w:t>
+            </w:r>
+            <w:r>
+              <w:rPr>
+                <w:rFonts w:eastAsia="Adobe Gothic Std B" w:ascii="Adobe Gothic Std B" w:hAnsi="Adobe Gothic Std B"/>
+              </w:rPr>
+              <w:t>Quantity</w:t>
             </w:r>
           </w:p>
         </w:tc>
@@ -429,6 +439,7 @@
           <w:tcPr>
             <w:tcW w:w="1561" w:type="dxa"/>
             <w:tcBorders>
+              <w:top w:val="nil"/>
               <w:left w:val="nil"/>
               <w:bottom w:val="single" w:sz="4" w:space="0" w:color="A6A6A6"/>
               <w:right w:val="nil"/>
@@ -477,10 +488,12 @@
         </w:tc>
         <w:tc>
           <w:tcPr>
-            <w:tcW w:w="1264" w:type="dxa"/>
+            <w:tcW w:w="1265" w:type="dxa"/>
             <w:tcBorders>
+              <w:top w:val="nil"/>
               <w:left w:val="nil"/>
               <w:bottom w:val="single" w:sz="4" w:space="0" w:color="A6A6A6"/>
+              <w:right w:val="nil"/>
             </w:tcBorders>
           </w:tcPr>
           <w:p>
@@ -596,7 +609,7 @@
         </w:tc>
         <w:tc>
           <w:tcPr>
-            <w:tcW w:w="1412" w:type="dxa"/>
+            <w:tcW w:w="1411" w:type="dxa"/>
             <w:tcBorders/>
             <w:tcMar>
               <w:top w:w="43" w:type="dxa"/>
@@ -649,7 +662,7 @@
         </w:tc>
         <w:tc>
           <w:tcPr>
-            <w:tcW w:w="1264" w:type="dxa"/>
+            <w:tcW w:w="1265" w:type="dxa"/>
             <w:tcBorders/>
             <w:tcMar>
               <w:top w:w="43" w:type="dxa"/>
@@ -745,7 +758,7 @@
         </w:tc>
         <w:tc>
           <w:tcPr>
-            <w:tcW w:w="1412" w:type="dxa"/>
+            <w:tcW w:w="1411" w:type="dxa"/>
             <w:tcBorders/>
             <w:tcMar>
               <w:top w:w="43" w:type="dxa"/>
@@ -770,27 +783,7 @@
                 <w:szCs w:val="20"/>
                 <w:lang w:val="en-US" w:eastAsia="en-US" w:bidi="ar-SA"/>
               </w:rPr>
-              <w:t>{{item[</w:t>
-            </w:r>
-            <w:r>
-              <w:rPr>
-                <w:rFonts w:eastAsia="Adobe Gothic Std B" w:cs="Times New Roman" w:ascii="Adobe Gothic Std B" w:hAnsi="Adobe Gothic Std B"/>
-                <w:kern w:val="0"/>
-                <w:sz w:val="20"/>
-                <w:szCs w:val="20"/>
-                <w:lang w:val="en-US" w:eastAsia="en-US" w:bidi="ar-SA"/>
-              </w:rPr>
-              <w:t>2</w:t>
-            </w:r>
-            <w:r>
-              <w:rPr>
-                <w:rFonts w:eastAsia="Adobe Gothic Std B" w:cs="Times New Roman" w:ascii="Adobe Gothic Std B" w:hAnsi="Adobe Gothic Std B"/>
-                <w:kern w:val="0"/>
-                <w:sz w:val="20"/>
-                <w:szCs w:val="20"/>
-                <w:lang w:val="en-US" w:eastAsia="en-US" w:bidi="ar-SA"/>
-              </w:rPr>
-              <w:t>]}}</w:t>
+              <w:t>{{item[2]}}</w:t>
             </w:r>
           </w:p>
         </w:tc>
@@ -823,33 +816,13 @@
                 <w:szCs w:val="20"/>
                 <w:lang w:val="en-US" w:eastAsia="en-US" w:bidi="ar-SA"/>
               </w:rPr>
-              <w:t>{{item[</w:t>
-            </w:r>
-            <w:r>
-              <w:rPr>
-                <w:rFonts w:eastAsia="Adobe Gothic Std B" w:cs="Times New Roman" w:ascii="Adobe Gothic Std B" w:hAnsi="Adobe Gothic Std B"/>
-                <w:kern w:val="0"/>
-                <w:sz w:val="20"/>
-                <w:szCs w:val="20"/>
-                <w:lang w:val="en-US" w:eastAsia="en-US" w:bidi="ar-SA"/>
-              </w:rPr>
-              <w:t>3</w:t>
-            </w:r>
-            <w:r>
-              <w:rPr>
-                <w:rFonts w:eastAsia="Adobe Gothic Std B" w:cs="Times New Roman" w:ascii="Adobe Gothic Std B" w:hAnsi="Adobe Gothic Std B"/>
-                <w:kern w:val="0"/>
-                <w:sz w:val="20"/>
-                <w:szCs w:val="20"/>
-                <w:lang w:val="en-US" w:eastAsia="en-US" w:bidi="ar-SA"/>
-              </w:rPr>
-              <w:t>]}}</w:t>
+              <w:t>{{item[3]}}</w:t>
             </w:r>
           </w:p>
         </w:tc>
         <w:tc>
           <w:tcPr>
-            <w:tcW w:w="1264" w:type="dxa"/>
+            <w:tcW w:w="1265" w:type="dxa"/>
             <w:tcBorders/>
             <w:tcMar>
               <w:top w:w="43" w:type="dxa"/>
@@ -876,27 +849,7 @@
                 <w:szCs w:val="20"/>
                 <w:lang w:val="en-US" w:eastAsia="en-US" w:bidi="ar-SA"/>
               </w:rPr>
-              <w:t>{{item[</w:t>
-            </w:r>
-            <w:r>
-              <w:rPr>
-                <w:rFonts w:eastAsia="Adobe Gothic Std B" w:cs="Times New Roman" w:ascii="Adobe Gothic Std B" w:hAnsi="Adobe Gothic Std B"/>
-                <w:kern w:val="0"/>
-                <w:sz w:val="20"/>
-                <w:szCs w:val="20"/>
-                <w:lang w:val="en-US" w:eastAsia="en-US" w:bidi="ar-SA"/>
-              </w:rPr>
-              <w:t>4</w:t>
-            </w:r>
-            <w:r>
-              <w:rPr>
-                <w:rFonts w:eastAsia="Adobe Gothic Std B" w:cs="Times New Roman" w:ascii="Adobe Gothic Std B" w:hAnsi="Adobe Gothic Std B"/>
-                <w:kern w:val="0"/>
-                <w:sz w:val="20"/>
-                <w:szCs w:val="20"/>
-                <w:lang w:val="en-US" w:eastAsia="en-US" w:bidi="ar-SA"/>
-              </w:rPr>
-              <w:t>]}}</w:t>
+              <w:t>{{item[4]}}</w:t>
             </w:r>
           </w:p>
         </w:tc>
@@ -966,7 +919,7 @@
         </w:tc>
         <w:tc>
           <w:tcPr>
-            <w:tcW w:w="1412" w:type="dxa"/>
+            <w:tcW w:w="1411" w:type="dxa"/>
             <w:tcBorders/>
             <w:tcMar>
               <w:top w:w="43" w:type="dxa"/>
@@ -1019,7 +972,7 @@
         </w:tc>
         <w:tc>
           <w:tcPr>
-            <w:tcW w:w="1264" w:type="dxa"/>
+            <w:tcW w:w="1265" w:type="dxa"/>
             <w:tcBorders/>
             <w:tcMar>
               <w:top w:w="43" w:type="dxa"/>
@@ -1051,7 +1004,7 @@
         </w:trPr>
         <w:tc>
           <w:tcPr>
-            <w:tcW w:w="7250" w:type="dxa"/>
+            <w:tcW w:w="7249" w:type="dxa"/>
             <w:gridSpan w:val="3"/>
             <w:vMerge w:val="restart"/>
             <w:tcBorders>
@@ -1115,7 +1068,7 @@
         </w:tc>
         <w:tc>
           <w:tcPr>
-            <w:tcW w:w="1264" w:type="dxa"/>
+            <w:tcW w:w="1265" w:type="dxa"/>
             <w:tcBorders/>
             <w:tcMar>
               <w:top w:w="43" w:type="dxa"/>
@@ -1150,7 +1103,7 @@
         </w:trPr>
         <w:tc>
           <w:tcPr>
-            <w:tcW w:w="7250" w:type="dxa"/>
+            <w:tcW w:w="7249" w:type="dxa"/>
             <w:gridSpan w:val="3"/>
             <w:vMerge w:val="continue"/>
             <w:tcBorders>
@@ -1235,7 +1188,7 @@
         </w:tc>
         <w:tc>
           <w:tcPr>
-            <w:tcW w:w="1264" w:type="dxa"/>
+            <w:tcW w:w="1265" w:type="dxa"/>
             <w:tcBorders/>
             <w:tcMar>
               <w:top w:w="43" w:type="dxa"/>
@@ -1270,7 +1223,7 @@
         </w:trPr>
         <w:tc>
           <w:tcPr>
-            <w:tcW w:w="7250" w:type="dxa"/>
+            <w:tcW w:w="7249" w:type="dxa"/>
             <w:gridSpan w:val="3"/>
             <w:vMerge w:val="continue"/>
             <w:tcBorders>
@@ -1355,7 +1308,7 @@
         </w:tc>
         <w:tc>
           <w:tcPr>
-            <w:tcW w:w="1264" w:type="dxa"/>
+            <w:tcW w:w="1265" w:type="dxa"/>
             <w:tcBorders/>
             <w:tcMar>
               <w:top w:w="43" w:type="dxa"/>
@@ -1456,7 +1409,7 @@
         </w:r>
         <w:r>
           <w:rPr/>
-          <w:t>0</w:t>
+          <w:t>2</w:t>
         </w:r>
         <w:r>
           <w:rPr/>

</xml_diff>

<commit_message>
Fix response, error handlers in case there is no data from query, rebuild how data is assigned in invoice
</commit_message>
<xml_diff>
--- a/src/model/templates/INVOICE/invoice_template.docx
+++ b/src/model/templates/INVOICE/invoice_template.docx
@@ -281,9 +281,9 @@
       <w:tblGrid>
         <w:gridCol w:w="1004"/>
         <w:gridCol w:w="4834"/>
-        <w:gridCol w:w="1411"/>
+        <w:gridCol w:w="1410"/>
         <w:gridCol w:w="1561"/>
-        <w:gridCol w:w="1265"/>
+        <w:gridCol w:w="1266"/>
       </w:tblGrid>
       <w:tr>
         <w:trPr>
@@ -294,8 +294,6 @@
           <w:tcPr>
             <w:tcW w:w="1004" w:type="dxa"/>
             <w:tcBorders>
-              <w:top w:val="nil"/>
-              <w:left w:val="nil"/>
               <w:bottom w:val="single" w:sz="4" w:space="0" w:color="A6A6A6"/>
               <w:right w:val="nil"/>
             </w:tcBorders>
@@ -353,7 +351,6 @@
           <w:tcPr>
             <w:tcW w:w="4834" w:type="dxa"/>
             <w:tcBorders>
-              <w:top w:val="nil"/>
               <w:left w:val="nil"/>
               <w:bottom w:val="single" w:sz="4" w:space="0" w:color="A6A6A6"/>
               <w:right w:val="nil"/>
@@ -402,9 +399,8 @@
         </w:tc>
         <w:tc>
           <w:tcPr>
-            <w:tcW w:w="1411" w:type="dxa"/>
+            <w:tcW w:w="1410" w:type="dxa"/>
             <w:tcBorders>
-              <w:top w:val="nil"/>
               <w:left w:val="nil"/>
               <w:bottom w:val="single" w:sz="4" w:space="0" w:color="A6A6A6"/>
               <w:right w:val="nil"/>
@@ -425,13 +421,7 @@
               <w:rPr>
                 <w:rFonts w:eastAsia="Adobe Gothic Std B" w:ascii="Adobe Gothic Std B" w:hAnsi="Adobe Gothic Std B"/>
               </w:rPr>
-              <w:t>Days/</w:t>
-            </w:r>
-            <w:r>
-              <w:rPr>
-                <w:rFonts w:eastAsia="Adobe Gothic Std B" w:ascii="Adobe Gothic Std B" w:hAnsi="Adobe Gothic Std B"/>
-              </w:rPr>
-              <w:t>Quantity</w:t>
+              <w:t>Days/Quantity</w:t>
             </w:r>
           </w:p>
         </w:tc>
@@ -439,7 +429,6 @@
           <w:tcPr>
             <w:tcW w:w="1561" w:type="dxa"/>
             <w:tcBorders>
-              <w:top w:val="nil"/>
               <w:left w:val="nil"/>
               <w:bottom w:val="single" w:sz="4" w:space="0" w:color="A6A6A6"/>
               <w:right w:val="nil"/>
@@ -488,12 +477,10 @@
         </w:tc>
         <w:tc>
           <w:tcPr>
-            <w:tcW w:w="1265" w:type="dxa"/>
+            <w:tcW w:w="1266" w:type="dxa"/>
             <w:tcBorders>
-              <w:top w:val="nil"/>
               <w:left w:val="nil"/>
               <w:bottom w:val="single" w:sz="4" w:space="0" w:color="A6A6A6"/>
-              <w:right w:val="nil"/>
             </w:tcBorders>
           </w:tcPr>
           <w:p>
@@ -513,7 +500,15 @@
                 <w:sz w:val="20"/>
                 <w:lang w:val="en-US" w:eastAsia="en-US" w:bidi="ar-SA"/>
               </w:rPr>
-              <w:t>Room total</w:t>
+              <w:t>T</w:t>
+            </w:r>
+            <w:r>
+              <w:rPr>
+                <w:rFonts w:eastAsia="Adobe Gothic Std B" w:ascii="Adobe Gothic Std B" w:hAnsi="Adobe Gothic Std B"/>
+                <w:sz w:val="20"/>
+                <w:lang w:val="en-US" w:eastAsia="en-US" w:bidi="ar-SA"/>
+              </w:rPr>
+              <w:t>otal</w:t>
             </w:r>
             <w:sdt>
               <w:sdtPr>
@@ -609,7 +604,7 @@
         </w:tc>
         <w:tc>
           <w:tcPr>
-            <w:tcW w:w="1411" w:type="dxa"/>
+            <w:tcW w:w="1410" w:type="dxa"/>
             <w:tcBorders/>
             <w:tcMar>
               <w:top w:w="43" w:type="dxa"/>
@@ -662,7 +657,7 @@
         </w:tc>
         <w:tc>
           <w:tcPr>
-            <w:tcW w:w="1265" w:type="dxa"/>
+            <w:tcW w:w="1266" w:type="dxa"/>
             <w:tcBorders/>
             <w:tcMar>
               <w:top w:w="43" w:type="dxa"/>
@@ -758,7 +753,7 @@
         </w:tc>
         <w:tc>
           <w:tcPr>
-            <w:tcW w:w="1411" w:type="dxa"/>
+            <w:tcW w:w="1410" w:type="dxa"/>
             <w:tcBorders/>
             <w:tcMar>
               <w:top w:w="43" w:type="dxa"/>
@@ -822,7 +817,7 @@
         </w:tc>
         <w:tc>
           <w:tcPr>
-            <w:tcW w:w="1265" w:type="dxa"/>
+            <w:tcW w:w="1266" w:type="dxa"/>
             <w:tcBorders/>
             <w:tcMar>
               <w:top w:w="43" w:type="dxa"/>
@@ -919,7 +914,7 @@
         </w:tc>
         <w:tc>
           <w:tcPr>
-            <w:tcW w:w="1411" w:type="dxa"/>
+            <w:tcW w:w="1410" w:type="dxa"/>
             <w:tcBorders/>
             <w:tcMar>
               <w:top w:w="43" w:type="dxa"/>
@@ -972,7 +967,7 @@
         </w:tc>
         <w:tc>
           <w:tcPr>
-            <w:tcW w:w="1265" w:type="dxa"/>
+            <w:tcW w:w="1266" w:type="dxa"/>
             <w:tcBorders/>
             <w:tcMar>
               <w:top w:w="43" w:type="dxa"/>
@@ -1004,7 +999,7 @@
         </w:trPr>
         <w:tc>
           <w:tcPr>
-            <w:tcW w:w="7249" w:type="dxa"/>
+            <w:tcW w:w="7248" w:type="dxa"/>
             <w:gridSpan w:val="3"/>
             <w:vMerge w:val="restart"/>
             <w:tcBorders>
@@ -1068,7 +1063,7 @@
         </w:tc>
         <w:tc>
           <w:tcPr>
-            <w:tcW w:w="1265" w:type="dxa"/>
+            <w:tcW w:w="1266" w:type="dxa"/>
             <w:tcBorders/>
             <w:tcMar>
               <w:top w:w="43" w:type="dxa"/>
@@ -1103,7 +1098,7 @@
         </w:trPr>
         <w:tc>
           <w:tcPr>
-            <w:tcW w:w="7249" w:type="dxa"/>
+            <w:tcW w:w="7248" w:type="dxa"/>
             <w:gridSpan w:val="3"/>
             <w:vMerge w:val="continue"/>
             <w:tcBorders>
@@ -1188,7 +1183,7 @@
         </w:tc>
         <w:tc>
           <w:tcPr>
-            <w:tcW w:w="1265" w:type="dxa"/>
+            <w:tcW w:w="1266" w:type="dxa"/>
             <w:tcBorders/>
             <w:tcMar>
               <w:top w:w="43" w:type="dxa"/>
@@ -1223,7 +1218,7 @@
         </w:trPr>
         <w:tc>
           <w:tcPr>
-            <w:tcW w:w="7249" w:type="dxa"/>
+            <w:tcW w:w="7248" w:type="dxa"/>
             <w:gridSpan w:val="3"/>
             <w:vMerge w:val="continue"/>
             <w:tcBorders>
@@ -1308,7 +1303,7 @@
         </w:tc>
         <w:tc>
           <w:tcPr>
-            <w:tcW w:w="1265" w:type="dxa"/>
+            <w:tcW w:w="1266" w:type="dxa"/>
             <w:tcBorders/>
             <w:tcMar>
               <w:top w:w="43" w:type="dxa"/>

</xml_diff>